<commit_message>
Actualizar apartado de uso de IA y responsabilidad de la autoría; agregar Perplexity a la cibergrafía
Co-Authored-By: Claude Opus 5.5 <noreply@anthropic.com>
Claude-Session: https://claude.ai/code/session_01R489uEgt2D3Wgzrtb2WuXE
</commit_message>
<xml_diff>
--- a/informe/Informe_ejecutivo_Cardio360.docx
+++ b/informe/Informe_ejecutivo_Cardio360.docx
@@ -3757,6 +3757,35 @@
         </w:numPr>
       </w:pPr>
       <w:r>
+        <w:t xml:space="preserve">Perplexity AI. (2026). </w:t>
+      </w:r>
+      <w:r>
+        <w:rPr>
+          <w:i/>
+        </w:rPr>
+        <w:t xml:space="preserve">Perplexity</w:t>
+      </w:r>
+      <w:r>
+        <w:t xml:space="preserve"> [Modelo de lenguaje grande]. </w:t>
+      </w:r>
+      <w:hyperlink r:id="rId19" w:history="1">
+        <w:r>
+          <w:rPr>
+            <w:rStyle w:val="Hyperlink"/>
+          </w:rPr>
+          <w:t xml:space="preserve">https://www.perplexity.ai/</w:t>
+        </w:r>
+      </w:hyperlink>
+    </w:p>
+    <w:p>
+      <w:pPr>
+        <w:pStyle w:val="ListParagraph"/>
+        <w:numPr>
+          <w:ilvl w:val="0"/>
+          <w:numId w:val="10"/>
+        </w:numPr>
+      </w:pPr>
+      <w:r>
         <w:t xml:space="preserve">Plotly. (s. f.). </w:t>
       </w:r>
       <w:r>
@@ -3768,7 +3797,7 @@
       <w:r>
         <w:t xml:space="preserve">. </w:t>
       </w:r>
-      <w:hyperlink r:id="rId19" w:history="1">
+      <w:hyperlink r:id="rId20" w:history="1">
         <w:r>
           <w:rPr>
             <w:rStyle w:val="Hyperlink"/>
@@ -3797,7 +3826,7 @@
       <w:r>
         <w:t xml:space="preserve"> (versión 1.9.1). </w:t>
       </w:r>
-      <w:hyperlink r:id="rId20" w:history="1">
+      <w:hyperlink r:id="rId21" w:history="1">
         <w:r>
           <w:rPr>
             <w:rStyle w:val="Hyperlink"/>
@@ -3826,7 +3855,7 @@
       <w:r>
         <w:t xml:space="preserve"> (versión 1.9.1). </w:t>
       </w:r>
-      <w:hyperlink r:id="rId21" w:history="1">
+      <w:hyperlink r:id="rId22" w:history="1">
         <w:r>
           <w:rPr>
             <w:rStyle w:val="Hyperlink"/>
@@ -3855,7 +3884,7 @@
       <w:r>
         <w:t xml:space="preserve">. </w:t>
       </w:r>
-      <w:hyperlink r:id="rId22" w:history="1">
+      <w:hyperlink r:id="rId23" w:history="1">
         <w:r>
           <w:rPr>
             <w:rStyle w:val="Hyperlink"/>
@@ -3913,7 +3942,7 @@
       <w:r>
         <w:t xml:space="preserve"> [Documentación]. </w:t>
       </w:r>
-      <w:hyperlink r:id="rId23" w:history="1">
+      <w:hyperlink r:id="rId24" w:history="1">
         <w:r>
           <w:rPr>
             <w:rStyle w:val="Hyperlink"/>
@@ -3942,7 +3971,7 @@
       <w:r>
         <w:t xml:space="preserve">, 2579–2605. </w:t>
       </w:r>
-      <w:hyperlink r:id="rId24" w:history="1">
+      <w:hyperlink r:id="rId25" w:history="1">
         <w:r>
           <w:rPr>
             <w:rStyle w:val="Hyperlink"/>
@@ -3971,7 +4000,7 @@
       <w:r>
         <w:t xml:space="preserve">(10). </w:t>
       </w:r>
-      <w:hyperlink r:id="rId25" w:history="1">
+      <w:hyperlink r:id="rId26" w:history="1">
         <w:r>
           <w:rPr>
             <w:rStyle w:val="Hyperlink"/>
@@ -4000,7 +4029,7 @@
       <w:r>
         <w:t xml:space="preserve">. </w:t>
       </w:r>
-      <w:hyperlink r:id="rId26" w:history="1">
+      <w:hyperlink r:id="rId27" w:history="1">
         <w:r>
           <w:rPr>
             <w:rStyle w:val="Hyperlink"/>
@@ -4029,7 +4058,7 @@
       <w:r>
         <w:t xml:space="preserve"> (versión 3.4.2). </w:t>
       </w:r>
-      <w:hyperlink r:id="rId27" w:history="1">
+      <w:hyperlink r:id="rId28" w:history="1">
         <w:r>
           <w:rPr>
             <w:rStyle w:val="Hyperlink"/>
@@ -4058,7 +4087,7 @@
       <w:r>
         <w:t xml:space="preserve">, 32–35. </w:t>
       </w:r>
-      <w:hyperlink r:id="rId28" w:history="1">
+      <w:hyperlink r:id="rId29" w:history="1">
         <w:r>
           <w:rPr>
             <w:rStyle w:val="Hyperlink"/>
@@ -4072,13 +4101,25 @@
         <w:pStyle w:val="Heading2"/>
       </w:pPr>
       <w:r>
-        <w:t xml:space="preserve">Declaración de uso de inteligencia artificial</w:t>
-      </w:r>
-    </w:p>
-    <w:p>
-      <w:pPr/>
-      <w:r>
-        <w:t xml:space="preserve">El proyecto se desarrolló con apoyo de Claude (Anthropic, 2026), un modelo de lenguaje grande. Claude ayudó a localizar y verificar los datos, a escribir el código de los cuadernos y del tablero, a redactar este informe y a comprobar la cibergrafía. El autor definió el alcance y validó las decisiones del análisis, y es responsable del contenido entregado.</w:t>
+        <w:t xml:space="preserve">Uso de inteligencia artificial y responsabilidad de la autoría</w:t>
+      </w:r>
+    </w:p>
+    <w:p>
+      <w:pPr/>
+      <w:r>
+        <w:t xml:space="preserve">El proyecto se desarrolló con el apoyo de dos herramientas de inteligencia artificial, Perplexity (Perplexity AI, 2026) y Claude (Anthropic, 2026), modelos de lenguaje grande utilizados como herramientas de asistencia durante distintas etapas del proceso. Su participación incluyó la búsqueda y verificación de fuentes de información, el apoyo en la construcción del código de los cuadernos de análisis y del tablero de visualización, la revisión y corrección de la redacción del informe y la comprobación de las referencias bibliográficas y la cibergrafía.</w:t>
+      </w:r>
+    </w:p>
+    <w:p>
+      <w:pPr/>
+      <w:r>
+        <w:t xml:space="preserve">El autor asumió la responsabilidad intelectual y metodológica del proyecto, que incluye el área y la problemática poblacional, la definición del problema de estudio, la formulación de los objetivos, la elaboración del plan de trabajo, la selección y justificación del conjunto de datos de carácter médico y la delimitación de las variables relevantes para el análisis. En esa misma línea, mediante la estrategia de Junta Técnica (una habilidad creada por el autor dentro de Claude para desarrollar ideas, construir soluciones y ejecutar proyectos evitando iteraciones ociosas e infructuosas, y optimizando los recursos más costosos: el tiempo humano y el procesamiento de IA), el autor definió los criterios de interpretación, la pertinencia de los procedimientos analíticos y la lectura de los resultados obtenidos, priorizando el estudio de los eventos de salud, sus patrones de comportamiento, su distribución y las posibles asociaciones entre las variables clínicas y epidemiológicas disponibles.</w:t>
+      </w:r>
+    </w:p>
+    <w:p>
+      <w:pPr/>
+      <w:r>
+        <w:t xml:space="preserve">La utilización de Claude constituyó un valioso apoyo técnico, documental y de programación, sin sustituir el juicio crítico del autor ni su responsabilidad sobre las decisiones metodológicas, la interpretación de los resultados y las conclusiones presentadas. El autor responde por la coherencia del proceso, la verificación de los resultados y la integridad del contenido entregado.</w:t>
       </w:r>
     </w:p>
     <w:sectPr>

</xml_diff>

<commit_message>
Informe ejecutivo: enlace al repositorio en GitHub con ícono en la portada
Co-Authored-By: Claude Opus 5.5 <noreply@anthropic.com>
Claude-Session: https://claude.ai/code/session_01R489uEgt2D3Wgzrtb2WuXE
</commit_message>
<xml_diff>
--- a/informe/Informe_ejecutivo_Cardio360.docx
+++ b/informe/Informe_ejecutivo_Cardio360.docx
@@ -42,6 +42,84 @@
       <w:r>
         <w:t xml:space="preserve"> Sergio Lara · Visualización de Datos · Fundación Universitaria San Mateo</w:t>
       </w:r>
+    </w:p>
+    <w:p>
+      <w:pPr/>
+      <w:hyperlink r:id="rId4" w:history="1">
+        <w:r>
+          <w:drawing>
+            <wp:inline distT="0" distB="0" distL="0" distR="0">
+              <wp:extent cx="5486400" cy="303862"/>
+              <wp:docPr id="1" name="image1" descr="Repositorio en GitHub: OmarLi-360/cardio360"/>
+              <a:graphic xmlns:a="http://schemas.openxmlformats.org/drawingml/2006/main">
+                <a:graphicData uri="http://schemas.openxmlformats.org/drawingml/2006/picture">
+                  <pic:pic xmlns:pic="http://schemas.openxmlformats.org/drawingml/2006/picture">
+                    <pic:nvPicPr>
+                      <pic:cNvPr id="1" name="image1" descr="Repositorio en GitHub: OmarLi-360/cardio360"/>
+                      <pic:cNvPicPr/>
+                    </pic:nvPicPr>
+                    <pic:blipFill>
+                      <a:blip r:embed="rId3"/>
+                      <a:stretch>
+                        <a:fillRect/>
+                      </a:stretch>
+                    </pic:blipFill>
+                    <pic:spPr>
+                      <a:xfrm>
+                        <a:off x="0" y="0"/>
+                        <a:ext cx="5486400" cy="303862"/>
+                      </a:xfrm>
+                      <a:prstGeom prst="rect">
+                        <a:avLst/>
+                      </a:prstGeom>
+                    </pic:spPr>
+                  </pic:pic>
+                </a:graphicData>
+              </a:graphic>
+            </wp:inline>
+          </w:drawing>
+        </w:r>
+      </w:hyperlink>
+    </w:p>
+    <w:p>
+      <w:pPr/>
+      <w:r>
+        <w:rPr>
+          <w:b/>
+        </w:rPr>
+        <w:t xml:space="preserve">Repositorio:</w:t>
+      </w:r>
+      <w:r>
+        <w:t xml:space="preserve"> </w:t>
+      </w:r>
+      <w:hyperlink r:id="rId4" w:history="1">
+        <w:r>
+          <w:rPr>
+            <w:rStyle w:val="Hyperlink"/>
+          </w:rPr>
+          <w:t xml:space="preserve">github.com/OmarLi-360/cardio360</w:t>
+        </w:r>
+      </w:hyperlink>
+      <w:r>
+        <w:t xml:space="preserve"> · </w:t>
+      </w:r>
+      <w:r>
+        <w:rPr>
+          <w:b/>
+        </w:rPr>
+        <w:t xml:space="preserve">Sitio:</w:t>
+      </w:r>
+      <w:r>
+        <w:t xml:space="preserve"> </w:t>
+      </w:r>
+      <w:hyperlink r:id="rId5" w:history="1">
+        <w:r>
+          <w:rPr>
+            <w:rStyle w:val="Hyperlink"/>
+          </w:rPr>
+          <w:t xml:space="preserve">omarli-360.github.io/cardio360</w:t>
+        </w:r>
+      </w:hyperlink>
     </w:p>
     <w:p>
       <w:pPr>
@@ -361,7 +439,7 @@
       <w:r>
         <w:t xml:space="preserve">Sitio del proyecto: </w:t>
       </w:r>
-      <w:hyperlink r:id="rId3" w:history="1">
+      <w:hyperlink r:id="rId5" w:history="1">
         <w:r>
           <w:rPr>
             <w:rStyle w:val="Hyperlink"/>
@@ -372,7 +450,7 @@
       <w:r>
         <w:t xml:space="preserve"> · Tablero interactivo: </w:t>
       </w:r>
-      <w:hyperlink r:id="rId4" w:history="1">
+      <w:hyperlink r:id="rId6" w:history="1">
         <w:r>
           <w:rPr>
             <w:rStyle w:val="Hyperlink"/>
@@ -383,7 +461,7 @@
       <w:r>
         <w:t xml:space="preserve"> · Repositorio: </w:t>
       </w:r>
-      <w:hyperlink r:id="rId5" w:history="1">
+      <w:hyperlink r:id="rId4" w:history="1">
         <w:r>
           <w:rPr>
             <w:rStyle w:val="Hyperlink"/>
@@ -429,7 +507,7 @@
       <w:r>
         <w:t xml:space="preserve"> El conjunto es el </w:t>
       </w:r>
-      <w:hyperlink r:id="rId6" w:history="1">
+      <w:hyperlink r:id="rId7" w:history="1">
         <w:r>
           <w:rPr>
             <w:rStyle w:val="Hyperlink"/>
@@ -823,16 +901,16 @@
         <w:drawing>
           <wp:inline distT="0" distB="0" distL="0" distR="0">
             <wp:extent cx="5486400" cy="2596242"/>
-            <wp:docPr id="1" name="image1" descr="Cuaderno 01 · 68.512 pacientes limpios · clasificación ACC/AHA 2017"/>
+            <wp:docPr id="2" name="image2" descr="Cuaderno 01 · 68.512 pacientes limpios · clasificación ACC/AHA 2017"/>
             <a:graphic xmlns:a="http://schemas.openxmlformats.org/drawingml/2006/main">
               <a:graphicData uri="http://schemas.openxmlformats.org/drawingml/2006/picture">
                 <pic:pic xmlns:pic="http://schemas.openxmlformats.org/drawingml/2006/picture">
                   <pic:nvPicPr>
-                    <pic:cNvPr id="1" name="image1" descr="Cuaderno 01 · 68.512 pacientes limpios · clasificación ACC/AHA 2017"/>
+                    <pic:cNvPr id="2" name="image2" descr="Cuaderno 01 · 68.512 pacientes limpios · clasificación ACC/AHA 2017"/>
                     <pic:cNvPicPr/>
                   </pic:nvPicPr>
                   <pic:blipFill>
-                    <a:blip r:embed="rId7"/>
+                    <a:blip r:embed="rId8"/>
                     <a:stretch>
                       <a:fillRect/>
                     </a:stretch>
@@ -2643,7 +2721,7 @@
       <w:r>
         <w:t xml:space="preserve">El </w:t>
       </w:r>
-      <w:hyperlink r:id="rId4" w:history="1">
+      <w:hyperlink r:id="rId6" w:history="1">
         <w:r>
           <w:rPr>
             <w:rStyle w:val="Hyperlink"/>
@@ -3135,7 +3213,7 @@
           </w:tcPr>
           <w:p>
             <w:pPr/>
-            <w:hyperlink r:id="rId3" w:history="1">
+            <w:hyperlink r:id="rId5" w:history="1">
               <w:r>
                 <w:rPr>
                   <w:rStyle w:val="Hyperlink"/>
@@ -3164,7 +3242,7 @@
           </w:tcPr>
           <w:p>
             <w:pPr/>
-            <w:hyperlink r:id="rId5" w:history="1">
+            <w:hyperlink r:id="rId4" w:history="1">
               <w:r>
                 <w:rPr>
                   <w:rStyle w:val="Hyperlink"/>
@@ -3449,7 +3527,7 @@
       <w:r>
         <w:t xml:space="preserve"> (claude-opus-5-5) [Modelo de lenguaje grande]. </w:t>
       </w:r>
-      <w:hyperlink r:id="rId8" w:history="1">
+      <w:hyperlink r:id="rId9" w:history="1">
         <w:r>
           <w:rPr>
             <w:rStyle w:val="Hyperlink"/>
@@ -3478,7 +3556,7 @@
       <w:r>
         <w:t xml:space="preserve"> [Repositorio de GitHub; copia de cardio_train.csv]. </w:t>
       </w:r>
-      <w:hyperlink r:id="rId9" w:history="1">
+      <w:hyperlink r:id="rId10" w:history="1">
         <w:r>
           <w:rPr>
             <w:rStyle w:val="Hyperlink"/>
@@ -3507,7 +3585,7 @@
       <w:r>
         <w:t xml:space="preserve"> (pp. 785–794). ACM. </w:t>
       </w:r>
-      <w:hyperlink r:id="rId10" w:history="1">
+      <w:hyperlink r:id="rId11" w:history="1">
         <w:r>
           <w:rPr>
             <w:rStyle w:val="Hyperlink"/>
@@ -3536,7 +3614,7 @@
       <w:r>
         <w:t xml:space="preserve"> [Entorno de cuadernos en la nube]. </w:t>
       </w:r>
-      <w:hyperlink r:id="rId11" w:history="1">
+      <w:hyperlink r:id="rId12" w:history="1">
         <w:r>
           <w:rPr>
             <w:rStyle w:val="Hyperlink"/>
@@ -3565,7 +3643,7 @@
       <w:r>
         <w:t xml:space="preserve">(1), 56–67. </w:t>
       </w:r>
-      <w:hyperlink r:id="rId12" w:history="1">
+      <w:hyperlink r:id="rId13" w:history="1">
         <w:r>
           <w:rPr>
             <w:rStyle w:val="Hyperlink"/>
@@ -3594,7 +3672,7 @@
       <w:r>
         <w:t xml:space="preserve">. </w:t>
       </w:r>
-      <w:hyperlink r:id="rId13" w:history="1">
+      <w:hyperlink r:id="rId14" w:history="1">
         <w:r>
           <w:rPr>
             <w:rStyle w:val="Hyperlink"/>
@@ -3623,7 +3701,7 @@
       <w:r>
         <w:t xml:space="preserve">. </w:t>
       </w:r>
-      <w:hyperlink r:id="rId14" w:history="1">
+      <w:hyperlink r:id="rId15" w:history="1">
         <w:r>
           <w:rPr>
             <w:rStyle w:val="Hyperlink"/>
@@ -3652,7 +3730,7 @@
       <w:r>
         <w:t xml:space="preserve"> [Preimpresión]. arXiv. </w:t>
       </w:r>
-      <w:hyperlink r:id="rId15" w:history="1">
+      <w:hyperlink r:id="rId16" w:history="1">
         <w:r>
           <w:rPr>
             <w:rStyle w:val="Hyperlink"/>
@@ -3681,7 +3759,7 @@
       <w:r>
         <w:t xml:space="preserve"> (pp. 220–229). ACM. </w:t>
       </w:r>
-      <w:hyperlink r:id="rId16" w:history="1">
+      <w:hyperlink r:id="rId17" w:history="1">
         <w:r>
           <w:rPr>
             <w:rStyle w:val="Hyperlink"/>
@@ -3710,7 +3788,7 @@
       <w:r>
         <w:t xml:space="preserve"> (versión 3.0.6). </w:t>
       </w:r>
-      <w:hyperlink r:id="rId17" w:history="1">
+      <w:hyperlink r:id="rId18" w:history="1">
         <w:r>
           <w:rPr>
             <w:rStyle w:val="Hyperlink"/>
@@ -3739,7 +3817,7 @@
       <w:r>
         <w:t xml:space="preserve">, 2825–2830. </w:t>
       </w:r>
-      <w:hyperlink r:id="rId18" w:history="1">
+      <w:hyperlink r:id="rId19" w:history="1">
         <w:r>
           <w:rPr>
             <w:rStyle w:val="Hyperlink"/>
@@ -3768,7 +3846,7 @@
       <w:r>
         <w:t xml:space="preserve"> [Modelo de lenguaje grande]. </w:t>
       </w:r>
-      <w:hyperlink r:id="rId19" w:history="1">
+      <w:hyperlink r:id="rId20" w:history="1">
         <w:r>
           <w:rPr>
             <w:rStyle w:val="Hyperlink"/>
@@ -3797,7 +3875,7 @@
       <w:r>
         <w:t xml:space="preserve">. </w:t>
       </w:r>
-      <w:hyperlink r:id="rId20" w:history="1">
+      <w:hyperlink r:id="rId21" w:history="1">
         <w:r>
           <w:rPr>
             <w:rStyle w:val="Hyperlink"/>
@@ -3826,7 +3904,7 @@
       <w:r>
         <w:t xml:space="preserve"> (versión 1.9.1). </w:t>
       </w:r>
-      <w:hyperlink r:id="rId21" w:history="1">
+      <w:hyperlink r:id="rId22" w:history="1">
         <w:r>
           <w:rPr>
             <w:rStyle w:val="Hyperlink"/>
@@ -3855,7 +3933,7 @@
       <w:r>
         <w:t xml:space="preserve"> (versión 1.9.1). </w:t>
       </w:r>
-      <w:hyperlink r:id="rId22" w:history="1">
+      <w:hyperlink r:id="rId23" w:history="1">
         <w:r>
           <w:rPr>
             <w:rStyle w:val="Hyperlink"/>
@@ -3884,7 +3962,7 @@
       <w:r>
         <w:t xml:space="preserve">. </w:t>
       </w:r>
-      <w:hyperlink r:id="rId23" w:history="1">
+      <w:hyperlink r:id="rId24" w:history="1">
         <w:r>
           <w:rPr>
             <w:rStyle w:val="Hyperlink"/>
@@ -3913,7 +3991,7 @@
       <w:r>
         <w:t xml:space="preserve"> [Conjunto de datos]. Kaggle. </w:t>
       </w:r>
-      <w:hyperlink r:id="rId6" w:history="1">
+      <w:hyperlink r:id="rId7" w:history="1">
         <w:r>
           <w:rPr>
             <w:rStyle w:val="Hyperlink"/>
@@ -3942,7 +4020,7 @@
       <w:r>
         <w:t xml:space="preserve"> [Documentación]. </w:t>
       </w:r>
-      <w:hyperlink r:id="rId24" w:history="1">
+      <w:hyperlink r:id="rId25" w:history="1">
         <w:r>
           <w:rPr>
             <w:rStyle w:val="Hyperlink"/>
@@ -3971,7 +4049,7 @@
       <w:r>
         <w:t xml:space="preserve">, 2579–2605. </w:t>
       </w:r>
-      <w:hyperlink r:id="rId25" w:history="1">
+      <w:hyperlink r:id="rId26" w:history="1">
         <w:r>
           <w:rPr>
             <w:rStyle w:val="Hyperlink"/>
@@ -4000,7 +4078,7 @@
       <w:r>
         <w:t xml:space="preserve">(10). </w:t>
       </w:r>
-      <w:hyperlink r:id="rId26" w:history="1">
+      <w:hyperlink r:id="rId27" w:history="1">
         <w:r>
           <w:rPr>
             <w:rStyle w:val="Hyperlink"/>
@@ -4029,7 +4107,7 @@
       <w:r>
         <w:t xml:space="preserve">. </w:t>
       </w:r>
-      <w:hyperlink r:id="rId27" w:history="1">
+      <w:hyperlink r:id="rId28" w:history="1">
         <w:r>
           <w:rPr>
             <w:rStyle w:val="Hyperlink"/>
@@ -4058,7 +4136,7 @@
       <w:r>
         <w:t xml:space="preserve"> (versión 3.4.2). </w:t>
       </w:r>
-      <w:hyperlink r:id="rId28" w:history="1">
+      <w:hyperlink r:id="rId29" w:history="1">
         <w:r>
           <w:rPr>
             <w:rStyle w:val="Hyperlink"/>
@@ -4087,7 +4165,7 @@
       <w:r>
         <w:t xml:space="preserve">, 32–35. </w:t>
       </w:r>
-      <w:hyperlink r:id="rId29" w:history="1">
+      <w:hyperlink r:id="rId30" w:history="1">
         <w:r>
           <w:rPr>
             <w:rStyle w:val="Hyperlink"/>

</xml_diff>

<commit_message>
Informe: portada con imagen del sitio y acceso al repositorio; correcciones del autor
- Portada nueva: imagen del sitio, ficha del proyecto y acceso a GitHub enlazado
- Incorpora las siete correcciones de redacción hechas por el autor en el Word
- Marco teórico inicia en página nueva; pie de página uniforme

Co-Authored-By: Claude Opus 5.5 <noreply@anthropic.com>
Claude-Session: https://claude.ai/code/session_01PXrGWUUGoUUFZ26YJ7HJ2z
</commit_message>
<xml_diff>
--- a/informe/Informe_ejecutivo_Cardio360.docx
+++ b/informe/Informe_ejecutivo_Cardio360.docx
@@ -4,12 +4,28 @@
   <w:body>
     <w:p>
       <w:pPr>
+        <w:spacing w:after="360" w:before="240"/>
+      </w:pPr>
+      <w:r>
+        <w:rPr>
+          <w:b/>
+          <w:bCs/>
+          <w:color w:val="B0283F"/>
+          <w:spacing w:val="50"/>
+          <w:sz w:val="17"/>
+          <w:szCs w:val="17"/>
+        </w:rPr>
+        <w:t xml:space="preserve">VISUALIZACIÓN DE DATOS  ·  FUNDACIÓN UNIVERSITARIA SAN MATEO</w:t>
+      </w:r>
+    </w:p>
+    <w:p>
+      <w:pPr>
         <w:pBdr>
-          <w:top w:val="single" w:color="B0283F" w:sz="6" w:space="6"/>
-          <w:bottom w:val="single" w:color="B0283F" w:sz="6" w:space="6"/>
+          <w:top w:val="single" w:color="B0283F" w:sz="6" w:space="8"/>
+          <w:bottom w:val="single" w:color="B0283F" w:sz="6" w:space="8"/>
         </w:pBdr>
         <w:shd w:fill="B0283F" w:color="auto" w:val="clear"/>
-        <w:spacing w:after="240" w:before="0"/>
+        <w:spacing w:after="360" w:before="0"/>
         <w:jc w:val="center"/>
       </w:pPr>
       <w:r>
@@ -17,7 +33,7 @@
           <w:b/>
           <w:bCs/>
           <w:color w:val="FFFFFF"/>
-          <w:spacing w:val="60"/>
+          <w:spacing w:val="80"/>
           <w:sz w:val="30"/>
           <w:szCs w:val="30"/>
         </w:rPr>
@@ -26,182 +42,477 @@
     </w:p>
     <w:p>
       <w:pPr>
-        <w:pStyle w:val="Title"/>
-      </w:pPr>
-      <w:r>
-        <w:t xml:space="preserve">Predicción de riesgo cardiovascular con aprendizaje automático</w:t>
-      </w:r>
-    </w:p>
-    <w:p>
-      <w:pPr>
-        <w:spacing w:after="240"/>
-      </w:pPr>
-      <w:r>
-        <w:rPr>
-          <w:color w:val="55504F"/>
-          <w:sz w:val="28"/>
-          <w:szCs w:val="28"/>
-        </w:rPr>
-        <w:t xml:space="preserve">Informe ejecutivo del proyecto Cardio360</w:t>
-      </w:r>
-    </w:p>
-    <w:p>
-      <w:pPr>
-        <w:spacing w:after="40"/>
-      </w:pPr>
-      <w:r>
-        <w:rPr>
+        <w:spacing w:after="200" w:before="120" w:line="300" w:lineRule="auto"/>
+      </w:pPr>
+      <w:r>
+        <w:rPr>
+          <w:rFonts w:ascii="Cambria" w:cs="Cambria" w:eastAsia="Cambria" w:hAnsi="Cambria"/>
           <w:b/>
           <w:bCs/>
-        </w:rPr>
-        <w:t xml:space="preserve">Autor:</w:t>
-      </w:r>
-      <w:r>
-        <w:t xml:space="preserve"> Omar Libardo Acelas Angulo</w:t>
-      </w:r>
-    </w:p>
-    <w:p>
-      <w:pPr>
-        <w:spacing w:after="40"/>
-      </w:pPr>
+          <w:color w:val="1C1A1A"/>
+          <w:sz w:val="56"/>
+          <w:szCs w:val="56"/>
+        </w:rPr>
+        <w:t xml:space="preserve">Predicción de riesgo cardiovascular con aprendizaje automático</w:t>
+      </w:r>
+    </w:p>
+    <w:p>
+      <w:pPr>
+        <w:pBdr>
+          <w:bottom w:val="single" w:color="B0283F" w:sz="12" w:space="14"/>
+        </w:pBdr>
+        <w:spacing w:after="360"/>
+      </w:pPr>
+      <w:r>
+        <w:rPr>
+          <w:color w:val="55504F"/>
+          <w:sz w:val="30"/>
+          <w:szCs w:val="30"/>
+        </w:rPr>
+        <w:t xml:space="preserve">Informe ejecutivo del proyecto Cardio360</w:t>
+      </w:r>
+    </w:p>
+    <w:p>
+      <w:pPr>
+        <w:pBdr>
+          <w:top w:val="single" w:color="D9D3D0" w:sz="4" w:space="2"/>
+          <w:left w:val="single" w:color="D9D3D0" w:sz="4" w:space="2"/>
+          <w:bottom w:val="single" w:color="D9D3D0" w:sz="4" w:space="2"/>
+          <w:right w:val="single" w:color="D9D3D0" w:sz="4" w:space="2"/>
+        </w:pBdr>
+        <w:spacing w:after="60" w:before="120"/>
+        <w:jc w:val="center"/>
+      </w:pPr>
+      <w:hyperlink w:history="1" r:id="rId11ac2dpvrebfspq2mmlwt">
+        <w:r>
+          <w:drawing>
+            <wp:inline distT="0" distB="0" distL="0" distR="0">
+              <wp:extent cx="5867400" cy="2495550"/>
+              <wp:effectExtent t="0" r="0" b="0" l="0"/>
+              <wp:docPr id="1" name="portada_sitio.png" descr="portada_sitio.png" title="portada_sitio.png">
+                <a:hlinkClick xmlns:a="http://schemas.openxmlformats.org/drawingml/2006/main" r:id="rId11ac2dpvrebfspq2mmlwt"/>
+              </wp:docPr>
+              <wp:cNvGraphicFramePr>
+                <a:graphicFrameLocks xmlns:a="http://schemas.openxmlformats.org/drawingml/2006/main" noChangeAspect="1"/>
+              </wp:cNvGraphicFramePr>
+              <a:graphic xmlns:a="http://schemas.openxmlformats.org/drawingml/2006/main">
+                <a:graphicData uri="http://schemas.openxmlformats.org/drawingml/2006/picture">
+                  <pic:pic xmlns:pic="http://schemas.openxmlformats.org/drawingml/2006/picture">
+                    <pic:nvPicPr>
+                      <pic:cNvPr id="0" name="" descr="">
+                        <a:hlinkClick r:id="rId11ac2dpvrebfspq2mmlwt"/>
+                      </pic:cNvPr>
+                      <pic:cNvPicPr>
+                        <a:picLocks noChangeAspect="1" noChangeArrowheads="1"/>
+                      </pic:cNvPicPr>
+                    </pic:nvPicPr>
+                    <pic:blipFill>
+                      <a:blip r:embed="rId11" cstate="none"/>
+                      <a:srcRect/>
+                      <a:stretch>
+                        <a:fillRect/>
+                      </a:stretch>
+                    </pic:blipFill>
+                    <pic:spPr bwMode="auto">
+                      <a:xfrm>
+                        <a:off x="0" y="0"/>
+                        <a:ext cx="5867400" cy="2495550"/>
+                      </a:xfrm>
+                      <a:prstGeom prst="rect">
+                        <a:avLst/>
+                      </a:prstGeom>
+                    </pic:spPr>
+                  </pic:pic>
+                </a:graphicData>
+              </a:graphic>
+            </wp:inline>
+          </w:drawing>
+        </w:r>
+      </w:hyperlink>
+    </w:p>
+    <w:p>
+      <w:pPr>
+        <w:spacing w:after="360"/>
+        <w:jc w:val="center"/>
+      </w:pPr>
+      <w:r>
+        <w:rPr>
+          <w:i/>
+          <w:iCs/>
+          <w:color w:val="857E7C"/>
+          <w:sz w:val="17"/>
+          <w:szCs w:val="17"/>
+        </w:rPr>
+        <w:t xml:space="preserve">Portada del sitio del proyecto, publicada en GitHub Pages</w:t>
+      </w:r>
+    </w:p>
+    <w:tbl>
+      <w:tblPr>
+        <w:tblW w:type="dxa" w:w="9360"/>
+        <w:tblBorders>
+          <w:top w:val="none" w:color="FFFFFF" w:sz="0"/>
+          <w:left w:val="none" w:color="FFFFFF" w:sz="0"/>
+          <w:bottom w:val="none" w:color="FFFFFF" w:sz="0"/>
+          <w:right w:val="none" w:color="FFFFFF" w:sz="0"/>
+          <w:insideH w:val="none" w:color="FFFFFF" w:sz="0"/>
+          <w:insideV w:val="none" w:color="FFFFFF" w:sz="0"/>
+        </w:tblBorders>
+      </w:tblPr>
+      <w:tblGrid>
+        <w:gridCol w:w="4680"/>
+        <w:gridCol w:w="4680"/>
+      </w:tblGrid>
+      <w:tr>
+        <w:tc>
+          <w:tcPr>
+            <w:tcW w:type="dxa" w:w="4680"/>
+            <w:tcBorders>
+              <w:top w:val="none" w:color="FFFFFF" w:sz="0"/>
+              <w:left w:val="none" w:color="FFFFFF" w:sz="0"/>
+              <w:bottom w:val="none" w:color="FFFFFF" w:sz="0"/>
+              <w:right w:val="none" w:color="FFFFFF" w:sz="0"/>
+            </w:tcBorders>
+            <w:tcMar>
+              <w:left w:type="dxa" w:w="0"/>
+              <w:right w:type="dxa" w:w="200"/>
+            </w:tcMar>
+          </w:tcPr>
+          <w:p>
+            <w:pPr>
+              <w:spacing w:after="10" w:before="120"/>
+            </w:pPr>
+            <w:r>
+              <w:rPr>
+                <w:b/>
+                <w:bCs/>
+                <w:color w:val="857E7C"/>
+                <w:spacing w:val="30"/>
+                <w:sz w:val="15"/>
+                <w:szCs w:val="15"/>
+              </w:rPr>
+              <w:t xml:space="preserve">AUTOR</w:t>
+            </w:r>
+          </w:p>
+          <w:p>
+            <w:pPr>
+              <w:spacing w:after="0"/>
+            </w:pPr>
+            <w:r>
+              <w:rPr>
+                <w:sz w:val="21"/>
+                <w:szCs w:val="21"/>
+              </w:rPr>
+              <w:t xml:space="preserve">Omar Libardo Acelas Angulo</w:t>
+            </w:r>
+          </w:p>
+          <w:p>
+            <w:pPr>
+              <w:spacing w:after="10" w:before="120"/>
+            </w:pPr>
+            <w:r>
+              <w:rPr>
+                <w:b/>
+                <w:bCs/>
+                <w:color w:val="857E7C"/>
+                <w:spacing w:val="30"/>
+                <w:sz w:val="15"/>
+                <w:szCs w:val="15"/>
+              </w:rPr>
+              <w:t xml:space="preserve">TUTOR</w:t>
+            </w:r>
+          </w:p>
+          <w:p>
+            <w:pPr>
+              <w:spacing w:after="0"/>
+            </w:pPr>
+            <w:r>
+              <w:rPr>
+                <w:sz w:val="21"/>
+                <w:szCs w:val="21"/>
+              </w:rPr>
+              <w:t xml:space="preserve">Sergio Lara</w:t>
+            </w:r>
+          </w:p>
+          <w:p>
+            <w:pPr>
+              <w:spacing w:after="10" w:before="120"/>
+            </w:pPr>
+            <w:r>
+              <w:rPr>
+                <w:b/>
+                <w:bCs/>
+                <w:color w:val="857E7C"/>
+                <w:spacing w:val="30"/>
+                <w:sz w:val="15"/>
+                <w:szCs w:val="15"/>
+              </w:rPr>
+              <w:t xml:space="preserve">ASIGNATURA</w:t>
+            </w:r>
+          </w:p>
+          <w:p>
+            <w:pPr>
+              <w:spacing w:after="0"/>
+            </w:pPr>
+            <w:r>
+              <w:rPr>
+                <w:sz w:val="21"/>
+                <w:szCs w:val="21"/>
+              </w:rPr>
+              <w:t xml:space="preserve">Visualización de Datos</w:t>
+            </w:r>
+          </w:p>
+          <w:p>
+            <w:pPr>
+              <w:spacing w:after="10" w:before="120"/>
+            </w:pPr>
+            <w:r>
+              <w:rPr>
+                <w:b/>
+                <w:bCs/>
+                <w:color w:val="857E7C"/>
+                <w:spacing w:val="30"/>
+                <w:sz w:val="15"/>
+                <w:szCs w:val="15"/>
+              </w:rPr>
+              <w:t xml:space="preserve">INSTITUCIÓN</w:t>
+            </w:r>
+          </w:p>
+          <w:p>
+            <w:pPr>
+              <w:spacing w:after="0"/>
+            </w:pPr>
+            <w:r>
+              <w:rPr>
+                <w:sz w:val="21"/>
+                <w:szCs w:val="21"/>
+              </w:rPr>
+              <w:t xml:space="preserve">Fundación Universitaria San Mateo</w:t>
+            </w:r>
+          </w:p>
+          <w:p>
+            <w:pPr>
+              <w:spacing w:after="10" w:before="120"/>
+            </w:pPr>
+            <w:r>
+              <w:rPr>
+                <w:b/>
+                <w:bCs/>
+                <w:color w:val="857E7C"/>
+                <w:spacing w:val="30"/>
+                <w:sz w:val="15"/>
+                <w:szCs w:val="15"/>
+              </w:rPr>
+              <w:t xml:space="preserve">LUGAR Y FECHA</w:t>
+            </w:r>
+          </w:p>
+          <w:p>
+            <w:pPr>
+              <w:spacing w:after="0"/>
+            </w:pPr>
+            <w:r>
+              <w:rPr>
+                <w:sz w:val="21"/>
+                <w:szCs w:val="21"/>
+              </w:rPr>
+              <w:t xml:space="preserve">Bogotá, 22 de octubre de 2026</w:t>
+            </w:r>
+          </w:p>
+        </w:tc>
+        <w:tc>
+          <w:tcPr>
+            <w:tcW w:type="dxa" w:w="4680"/>
+            <w:tcBorders>
+              <w:top w:val="none" w:color="FFFFFF" w:sz="0"/>
+              <w:left w:val="single" w:color="D9D3D0" w:sz="6"/>
+              <w:bottom w:val="none" w:color="FFFFFF" w:sz="0"/>
+              <w:right w:val="none" w:color="FFFFFF" w:sz="0"/>
+            </w:tcBorders>
+            <w:tcMar>
+              <w:left w:type="dxa" w:w="300"/>
+              <w:right w:type="dxa" w:w="0"/>
+            </w:tcMar>
+          </w:tcPr>
+          <w:p>
+            <w:pPr>
+              <w:spacing w:after="10" w:before="120"/>
+            </w:pPr>
+            <w:r>
+              <w:rPr>
+                <w:b/>
+                <w:bCs/>
+                <w:color w:val="857E7C"/>
+                <w:spacing w:val="30"/>
+                <w:sz w:val="15"/>
+                <w:szCs w:val="15"/>
+              </w:rPr>
+              <w:t xml:space="preserve">CÓDIGO FUENTE</w:t>
+            </w:r>
+          </w:p>
+          <w:p>
+            <w:pPr>
+              <w:spacing w:after="60" w:before="60"/>
+            </w:pPr>
+            <w:hyperlink w:history="1" r:id="rIdq6stdwxqeudltwk9tjjlb">
+              <w:r>
+                <w:drawing>
+                  <wp:inline distT="0" distB="0" distL="0" distR="0">
+                    <wp:extent cx="2762250" cy="257175"/>
+                    <wp:effectExtent t="0" r="0" b="0" l="0"/>
+                    <wp:docPr id="2" name="github_repositorio.png" descr="github_repositorio.png" title="github_repositorio.png">
+                      <a:hlinkClick xmlns:a="http://schemas.openxmlformats.org/drawingml/2006/main" r:id="rIdq6stdwxqeudltwk9tjjlb"/>
+                    </wp:docPr>
+                    <wp:cNvGraphicFramePr>
+                      <a:graphicFrameLocks xmlns:a="http://schemas.openxmlformats.org/drawingml/2006/main" noChangeAspect="1"/>
+                    </wp:cNvGraphicFramePr>
+                    <a:graphic xmlns:a="http://schemas.openxmlformats.org/drawingml/2006/main">
+                      <a:graphicData uri="http://schemas.openxmlformats.org/drawingml/2006/picture">
+                        <pic:pic xmlns:pic="http://schemas.openxmlformats.org/drawingml/2006/picture">
+                          <pic:nvPicPr>
+                            <pic:cNvPr id="0" name="" descr="">
+                              <a:hlinkClick r:id="rIdq6stdwxqeudltwk9tjjlb"/>
+                            </pic:cNvPr>
+                            <pic:cNvPicPr>
+                              <a:picLocks noChangeAspect="1" noChangeArrowheads="1"/>
+                            </pic:cNvPicPr>
+                          </pic:nvPicPr>
+                          <pic:blipFill>
+                            <a:blip r:embed="rId12" cstate="none"/>
+                            <a:srcRect/>
+                            <a:stretch>
+                              <a:fillRect/>
+                            </a:stretch>
+                          </pic:blipFill>
+                          <pic:spPr bwMode="auto">
+                            <a:xfrm>
+                              <a:off x="0" y="0"/>
+                              <a:ext cx="2762250" cy="257175"/>
+                            </a:xfrm>
+                            <a:prstGeom prst="rect">
+                              <a:avLst/>
+                            </a:prstGeom>
+                          </pic:spPr>
+                        </pic:pic>
+                      </a:graphicData>
+                    </a:graphic>
+                  </wp:inline>
+                </w:drawing>
+              </w:r>
+            </w:hyperlink>
+          </w:p>
+          <w:p>
+            <w:pPr>
+              <w:spacing w:after="0"/>
+            </w:pPr>
+            <w:hyperlink w:history="1" r:id="rIdb_wqm_s9jmvrzos44xfno">
+              <w:r>
+                <w:rPr>
+                  <w:rStyle w:val="Hyperlink"/>
+                </w:rPr>
+                <w:t xml:space="preserve">github.com/OmarLi-360/cardio360</w:t>
+              </w:r>
+            </w:hyperlink>
+          </w:p>
+          <w:p>
+            <w:pPr>
+              <w:spacing w:after="10" w:before="120"/>
+            </w:pPr>
+            <w:r>
+              <w:rPr>
+                <w:b/>
+                <w:bCs/>
+                <w:color w:val="857E7C"/>
+                <w:spacing w:val="30"/>
+                <w:sz w:val="15"/>
+                <w:szCs w:val="15"/>
+              </w:rPr>
+              <w:t xml:space="preserve">SITIO DEL PROYECTO</w:t>
+            </w:r>
+          </w:p>
+          <w:p>
+            <w:hyperlink w:history="1" r:id="rIdbmdefe8fvm4-_5yvi9uwk">
+              <w:r>
+                <w:rPr>
+                  <w:rStyle w:val="Hyperlink"/>
+                </w:rPr>
+                <w:t xml:space="preserve">omarli-360.github.io/cardio360</w:t>
+              </w:r>
+            </w:hyperlink>
+          </w:p>
+          <w:p>
+            <w:pPr>
+              <w:spacing w:after="10" w:before="120"/>
+            </w:pPr>
+            <w:r>
+              <w:rPr>
+                <w:b/>
+                <w:bCs/>
+                <w:color w:val="857E7C"/>
+                <w:spacing w:val="30"/>
+                <w:sz w:val="15"/>
+                <w:szCs w:val="15"/>
+              </w:rPr>
+              <w:t xml:space="preserve">TABLERO INTERACTIVO</w:t>
+            </w:r>
+          </w:p>
+          <w:p>
+            <w:hyperlink w:history="1" r:id="rIdg-iwwfuqnl1evnsjancw5">
+              <w:r>
+                <w:rPr>
+                  <w:rStyle w:val="Hyperlink"/>
+                </w:rPr>
+                <w:t xml:space="preserve">omarli-360.github.io/cardio360/tablero</w:t>
+              </w:r>
+            </w:hyperlink>
+          </w:p>
+        </w:tc>
+      </w:tr>
+    </w:tbl>
+    <w:p>
+      <w:r>
+        <w:br w:type="page"/>
+      </w:r>
+    </w:p>
+    <w:p>
+      <w:pPr>
+        <w:pStyle w:val="Heading1"/>
+        <w:keepNext/>
+        <w:keepLines/>
+      </w:pPr>
+      <w:r>
+        <w:t xml:space="preserve">1. Resumen ejecutivo</w:t>
+      </w:r>
+    </w:p>
+    <w:p>
+      <w:pPr>
+        <w:spacing w:after="140" w:line="288"/>
+      </w:pPr>
+      <w:r>
+        <w:t xml:space="preserve">Con catorce variables de un examen médico de rutina es posible anticipar la enfermedad cardiovascular (ECV) con un AUC-ROC de </w:t>
+      </w:r>
       <w:r>
         <w:rPr>
           <w:b/>
           <w:bCs/>
         </w:rPr>
-        <w:t xml:space="preserve">Tutor:</w:t>
-      </w:r>
-      <w:r>
-        <w:t xml:space="preserve"> Sergio Lara</w:t>
-      </w:r>
-    </w:p>
-    <w:p>
-      <w:pPr>
-        <w:spacing w:after="40"/>
+        <w:t xml:space="preserve">0,803</w:t>
+      </w:r>
+      <w:r>
+        <w:t xml:space="preserve">. El mejor modelo, XGBoost, se evaluó con 13.703 pacientes que no participaron en su entrenamiento. El resultado deja una idea que recorre todo el informe: el límite no lo pone el algoritmo ni la cantidad de datos, sino la información que puede extraerse de las variables disponibles.</w:t>
+      </w:r>
+    </w:p>
+    <w:p>
+      <w:pPr>
+        <w:spacing w:after="140" w:line="288"/>
       </w:pPr>
       <w:r>
         <w:rPr>
           <w:b/>
           <w:bCs/>
         </w:rPr>
-        <w:t xml:space="preserve">Asignatura:</w:t>
-      </w:r>
-      <w:r>
-        <w:t xml:space="preserve"> Visualización de Datos · Fundación Universitaria San Mateo</w:t>
-      </w:r>
-    </w:p>
-    <w:p>
-      <w:pPr>
-        <w:spacing w:after="160"/>
-      </w:pPr>
-      <w:r>
-        <w:rPr>
-          <w:b/>
-          <w:bCs/>
-        </w:rPr>
-        <w:t xml:space="preserve">Fecha:</w:t>
-      </w:r>
-      <w:r>
-        <w:t xml:space="preserve"> Bogotá, 22 de octubre de 2026</w:t>
-      </w:r>
-    </w:p>
-    <w:p>
-      <w:pPr>
-        <w:spacing w:after="40"/>
-      </w:pPr>
-      <w:r>
-        <w:rPr>
-          <w:b/>
-          <w:bCs/>
-        </w:rPr>
-        <w:t xml:space="preserve">Sitio del proyecto: </w:t>
-      </w:r>
-      <w:hyperlink w:history="1" r:id="rIdxk-xgptwgppt2296s1i5a">
-        <w:r>
-          <w:rPr>
-            <w:rStyle w:val="Hyperlink"/>
-          </w:rPr>
-          <w:t xml:space="preserve">omarli-360.github.io/cardio360</w:t>
-        </w:r>
-      </w:hyperlink>
-      <w:r>
-        <w:rPr>
-          <w:b/>
-          <w:bCs/>
-        </w:rPr>
-        <w:t xml:space="preserve">   ·   Tablero interactivo: </w:t>
-      </w:r>
-      <w:hyperlink w:history="1" r:id="rIdcsjdyp5ch_czkkyaah7fl">
-        <w:r>
-          <w:rPr>
-            <w:rStyle w:val="Hyperlink"/>
-          </w:rPr>
-          <w:t xml:space="preserve">omarli-360.github.io/cardio360/tablero</w:t>
-        </w:r>
-      </w:hyperlink>
-    </w:p>
-    <w:p>
-      <w:pPr>
-        <w:pBdr>
-          <w:bottom w:val="single" w:color="D9D3D0" w:sz="6" w:space="10"/>
-        </w:pBdr>
-        <w:spacing w:after="280"/>
-      </w:pPr>
-      <w:r>
-        <w:rPr>
-          <w:b/>
-          <w:bCs/>
-        </w:rPr>
-        <w:t xml:space="preserve">Repositorio: </w:t>
-      </w:r>
-      <w:hyperlink w:history="1" r:id="rIdrvdugqpiag6yprkfw5n64">
-        <w:r>
-          <w:rPr>
-            <w:rStyle w:val="Hyperlink"/>
-          </w:rPr>
-          <w:t xml:space="preserve">github.com/OmarLi-360/cardio360</w:t>
-        </w:r>
-      </w:hyperlink>
-    </w:p>
-    <w:p>
-      <w:pPr>
-        <w:pStyle w:val="Heading1"/>
-      </w:pPr>
-      <w:r>
-        <w:t xml:space="preserve">1. Resumen ejecutivo</w:t>
-      </w:r>
-    </w:p>
-    <w:p>
-      <w:pPr>
-        <w:spacing w:after="140" w:line="288"/>
-      </w:pPr>
-      <w:r>
-        <w:t xml:space="preserve">Con catorce variables de un examen médico de rutina es posible anticipar la enfermedad cardiovascular (ECV) con un AUC-ROC de </w:t>
-      </w:r>
-      <w:r>
-        <w:rPr>
-          <w:b/>
-          <w:bCs/>
-        </w:rPr>
-        <w:t xml:space="preserve">0,803</w:t>
-      </w:r>
-      <w:r>
-        <w:t xml:space="preserve">. El mejor modelo, XGBoost, se evaluó con 13.703 pacientes que no participaron en su entrenamiento. El resultado deja una idea que recorre todo el informe: el límite no lo pone el algoritmo ni la cantidad de datos, sino la información que traen las variables disponibles.</w:t>
-      </w:r>
-    </w:p>
-    <w:p>
-      <w:pPr>
-        <w:spacing w:after="140" w:line="288"/>
-      </w:pPr>
-      <w:r>
-        <w:rPr>
-          <w:b/>
-          <w:bCs/>
-        </w:rPr>
         <w:t xml:space="preserve">El problema.</w:t>
       </w:r>
       <w:r>
-        <w:t xml:space="preserve"> El proyecto final de Visualización de Datos pedía seleccionar un conjunto de datos, explorarlo con visualizaciones básicas, entrenar un modelo de aprendizaje automático, mostrar su desempeño con curvas de aprendizaje y de validación, aplicar reducción de dimensionalidad y construir una visualización interactiva de los resultados.</w:t>
+        <w:t xml:space="preserve"> El proyecto final de Visualización de Datos propone seleccionar un conjunto de datos, explorarlo con visualizaciones básicas, entrenar un modelo de aprendizaje automático, mostrar su desempeño con curvas de aprendizaje y de validación, aplicar reducción de dimensionalidad y construir una visualización interactiva de los resultados.</w:t>
       </w:r>
     </w:p>
     <w:p>
@@ -766,6 +1077,8 @@
     <w:p>
       <w:pPr>
         <w:pStyle w:val="Heading1"/>
+        <w:keepNext/>
+        <w:keepLines/>
       </w:pPr>
       <w:r>
         <w:t xml:space="preserve">2. Objetivos</w:t>
@@ -774,6 +1087,8 @@
     <w:p>
       <w:pPr>
         <w:pStyle w:val="Heading2"/>
+        <w:keepNext/>
+        <w:keepLines/>
       </w:pPr>
       <w:r>
         <w:t xml:space="preserve">Objetivo general</w:t>
@@ -790,6 +1105,8 @@
     <w:p>
       <w:pPr>
         <w:pStyle w:val="Heading2"/>
+        <w:keepNext/>
+        <w:keepLines/>
       </w:pPr>
       <w:r>
         <w:t xml:space="preserve">Objetivos específicos</w:t>
@@ -876,6 +1193,8 @@
     <w:p>
       <w:pPr>
         <w:pStyle w:val="Heading1"/>
+        <w:keepNext/>
+        <w:keepLines/>
       </w:pPr>
       <w:r>
         <w:t xml:space="preserve">3. Cumplimiento del alcance</w:t>
@@ -1512,6 +1831,8 @@
     <w:p>
       <w:pPr>
         <w:pStyle w:val="Heading1"/>
+        <w:keepNext/>
+        <w:pageBreakBefore/>
       </w:pPr>
       <w:r>
         <w:t xml:space="preserve">4. Marco teórico</w:t>
@@ -1528,6 +1849,8 @@
     <w:p>
       <w:pPr>
         <w:pStyle w:val="Heading2"/>
+        <w:keepNext/>
+        <w:keepLines/>
       </w:pPr>
       <w:r>
         <w:t xml:space="preserve">4.1 Aprendizaje supervisado y validación de un modelo</w:t>
@@ -1566,7 +1889,7 @@
         <w:spacing w:after="140" w:line="288"/>
       </w:pPr>
       <w:r>
-        <w:t xml:space="preserve">Para medir el desempeño con honestidad se separa un </w:t>
+        <w:t xml:space="preserve">Para medir el desempeño con objetividad se separa un </w:t>
       </w:r>
       <w:r>
         <w:rPr>
@@ -1614,7 +1937,7 @@
         <w:t xml:space="preserve">curva de validación</w:t>
       </w:r>
       <w:r>
-        <w:t xml:space="preserve"> fija los datos y varía la complejidad del modelo: muestra el punto donde la curva de entrenamiento sigue subiendo mientras la de validación se estanca o cae, que es donde empieza el sobreajuste. La </w:t>
+        <w:t xml:space="preserve"> fija los datos y varía la complejidad del modelo: muestra el punto donde la curva de entrenamiento sigue subiendo mientras la de validación se estanca o cae, en este punto es donde empieza el sobreajuste. La </w:t>
       </w:r>
       <w:r>
         <w:rPr>
@@ -1645,7 +1968,7 @@
         <w:t xml:space="preserve">Para recordar. </w:t>
       </w:r>
       <w:r>
-        <w:t xml:space="preserve">Si en la curva de aprendizaje las dos curvas convergen en un valor modesto, el modelo tiene </w:t>
+        <w:t xml:space="preserve">Si en la curva de aprendizaje las dos curvas convergen en un valor bajo, el modelo tiene </w:t>
       </w:r>
       <w:r>
         <w:rPr>
@@ -1671,6 +1994,8 @@
     <w:p>
       <w:pPr>
         <w:pStyle w:val="Heading2"/>
+        <w:keepNext/>
+        <w:keepLines/>
       </w:pPr>
       <w:r>
         <w:t xml:space="preserve">4.2 Los tres modelos comparados</w:t>
@@ -2469,6 +2794,8 @@
     <w:p>
       <w:pPr>
         <w:pStyle w:val="Heading2"/>
+        <w:keepNext/>
+        <w:keepLines/>
       </w:pPr>
       <w:r>
         <w:t xml:space="preserve">4.3 Cómo se mide el desempeño</w:t>
@@ -2639,6 +2966,8 @@
     <w:p>
       <w:pPr>
         <w:pStyle w:val="Heading2"/>
+        <w:keepNext/>
+        <w:keepLines/>
       </w:pPr>
       <w:r>
         <w:t xml:space="preserve">4.4 Explicabilidad con SHAP</w:t>
@@ -2696,6 +3025,8 @@
     <w:p>
       <w:pPr>
         <w:pStyle w:val="Heading2"/>
+        <w:keepNext/>
+        <w:keepLines/>
       </w:pPr>
       <w:r>
         <w:t xml:space="preserve">4.5 Reducción de dimensionalidad</w:t>
@@ -2822,7 +3153,7 @@
           <w:b/>
           <w:bCs/>
         </w:rPr>
-        <w:t xml:space="preserve">mirar</w:t>
+        <w:t xml:space="preserve">observar</w:t>
       </w:r>
       <w:r>
         <w:t xml:space="preserve">, no para </w:t>
@@ -2841,6 +3172,8 @@
     <w:p>
       <w:pPr>
         <w:pStyle w:val="Heading1"/>
+        <w:keepNext/>
+        <w:keepLines/>
       </w:pPr>
       <w:r>
         <w:t xml:space="preserve">5. Datos y limpieza</w:t>
@@ -5463,6 +5796,8 @@
     <w:p>
       <w:pPr>
         <w:pStyle w:val="Heading1"/>
+        <w:keepNext/>
+        <w:keepLines/>
       </w:pPr>
       <w:r>
         <w:t xml:space="preserve">6. Análisis exploratorio</w:t>
@@ -5512,7 +5847,7 @@
           <wp:inline distT="0" distB="0" distL="0" distR="0">
             <wp:extent cx="5943600" cy="2686050"/>
             <wp:effectExtent t="0" r="0" b="0" l="0"/>
-            <wp:docPr id="1" name="fig1_prevalencia.png" descr="Proporción de pacientes con ECV según la presión arterial y la edad" title="Proporción de pacientes con ECV según la presión arterial y la edad"/>
+            <wp:docPr id="3" name="fig1_prevalencia.png" descr="Proporción de pacientes con ECV según la presión arterial y la edad" title="Proporción de pacientes con ECV según la presión arterial y la edad"/>
             <wp:cNvGraphicFramePr>
               <a:graphicFrameLocks xmlns:a="http://schemas.openxmlformats.org/drawingml/2006/main" noChangeAspect="1"/>
             </wp:cNvGraphicFramePr>
@@ -5526,7 +5861,7 @@
                     </pic:cNvPicPr>
                   </pic:nvPicPr>
                   <pic:blipFill>
-                    <a:blip r:embed="rId9" cstate="none"/>
+                    <a:blip r:embed="rId13" cstate="none"/>
                     <a:srcRect/>
                     <a:stretch>
                       <a:fillRect/>
@@ -5662,6 +5997,8 @@
     <w:p>
       <w:pPr>
         <w:pStyle w:val="Heading1"/>
+        <w:keepNext/>
+        <w:keepLines/>
       </w:pPr>
       <w:r>
         <w:t xml:space="preserve">7. Modelado y diagnóstico de ajuste</w:t>
@@ -5832,7 +6169,7 @@
           <wp:inline distT="0" distB="0" distL="0" distR="0">
             <wp:extent cx="5943600" cy="1876425"/>
             <wp:effectExtent t="0" r="0" b="0" l="0"/>
-            <wp:docPr id="2" name="fig2_curvas_validacion.png" descr="Curvas de validación: AUC según la complejidad de cada modelo" title="Curvas de validación: AUC según la complejidad de cada modelo"/>
+            <wp:docPr id="4" name="fig2_curvas_validacion.png" descr="Curvas de validación: AUC según la complejidad de cada modelo" title="Curvas de validación: AUC según la complejidad de cada modelo"/>
             <wp:cNvGraphicFramePr>
               <a:graphicFrameLocks xmlns:a="http://schemas.openxmlformats.org/drawingml/2006/main" noChangeAspect="1"/>
             </wp:cNvGraphicFramePr>
@@ -5846,7 +6183,7 @@
                     </pic:cNvPicPr>
                   </pic:nvPicPr>
                   <pic:blipFill>
-                    <a:blip r:embed="rId10" cstate="none"/>
+                    <a:blip r:embed="rId14" cstate="none"/>
                     <a:srcRect/>
                     <a:stretch>
                       <a:fillRect/>
@@ -5942,7 +6279,7 @@
           <wp:inline distT="0" distB="0" distL="0" distR="0">
             <wp:extent cx="5943600" cy="1876425"/>
             <wp:effectExtent t="0" r="0" b="0" l="0"/>
-            <wp:docPr id="3" name="fig3_curvas_aprendizaje.png" descr="Curvas de aprendizaje: AUC según el número de pacientes de entrenamiento" title="Curvas de aprendizaje: AUC según el número de pacientes de entrenamiento"/>
+            <wp:docPr id="5" name="fig3_curvas_aprendizaje.png" descr="Curvas de aprendizaje: AUC según el número de pacientes de entrenamiento" title="Curvas de aprendizaje: AUC según el número de pacientes de entrenamiento"/>
             <wp:cNvGraphicFramePr>
               <a:graphicFrameLocks xmlns:a="http://schemas.openxmlformats.org/drawingml/2006/main" noChangeAspect="1"/>
             </wp:cNvGraphicFramePr>
@@ -5956,7 +6293,7 @@
                     </pic:cNvPicPr>
                   </pic:nvPicPr>
                   <pic:blipFill>
-                    <a:blip r:embed="rId11" cstate="none"/>
+                    <a:blip r:embed="rId15" cstate="none"/>
                     <a:srcRect/>
                     <a:stretch>
                       <a:fillRect/>
@@ -7400,7 +7737,7 @@
           <wp:inline distT="0" distB="0" distL="0" distR="0">
             <wp:extent cx="3810000" cy="4000500"/>
             <wp:effectExtent t="0" r="0" b="0" l="0"/>
-            <wp:docPr id="4" name="fig4_roc.png" descr="Curvas ROC de los tres modelos en el conjunto de prueba" title="Curvas ROC de los tres modelos en el conjunto de prueba"/>
+            <wp:docPr id="6" name="fig4_roc.png" descr="Curvas ROC de los tres modelos en el conjunto de prueba" title="Curvas ROC de los tres modelos en el conjunto de prueba"/>
             <wp:cNvGraphicFramePr>
               <a:graphicFrameLocks xmlns:a="http://schemas.openxmlformats.org/drawingml/2006/main" noChangeAspect="1"/>
             </wp:cNvGraphicFramePr>
@@ -7414,7 +7751,7 @@
                     </pic:cNvPicPr>
                   </pic:nvPicPr>
                   <pic:blipFill>
-                    <a:blip r:embed="rId12" cstate="none"/>
+                    <a:blip r:embed="rId16" cstate="none"/>
                     <a:srcRect/>
                     <a:stretch>
                       <a:fillRect/>
@@ -7470,6 +7807,8 @@
     <w:p>
       <w:pPr>
         <w:pStyle w:val="Heading1"/>
+        <w:keepNext/>
+        <w:keepLines/>
       </w:pPr>
       <w:r>
         <w:t xml:space="preserve">8. Umbral, calibración, explicabilidad y equidad</w:t>
@@ -8407,7 +8746,7 @@
           <wp:inline distT="0" distB="0" distL="0" distR="0">
             <wp:extent cx="4762500" cy="3181350"/>
             <wp:effectExtent t="0" r="0" b="0" l="0"/>
-            <wp:docPr id="5" name="fig5_shap.png" descr="Importancia global de las variables en XGBoost" title="Importancia global de las variables en XGBoost"/>
+            <wp:docPr id="7" name="fig5_shap.png" descr="Importancia global de las variables en XGBoost" title="Importancia global de las variables en XGBoost"/>
             <wp:cNvGraphicFramePr>
               <a:graphicFrameLocks xmlns:a="http://schemas.openxmlformats.org/drawingml/2006/main" noChangeAspect="1"/>
             </wp:cNvGraphicFramePr>
@@ -8421,7 +8760,7 @@
                     </pic:cNvPicPr>
                   </pic:nvPicPr>
                   <pic:blipFill>
-                    <a:blip r:embed="rId13" cstate="none"/>
+                    <a:blip r:embed="rId17" cstate="none"/>
                     <a:srcRect/>
                     <a:stretch>
                       <a:fillRect/>
@@ -9701,6 +10040,8 @@
     <w:p>
       <w:pPr>
         <w:pStyle w:val="Heading1"/>
+        <w:keepNext/>
+        <w:keepLines/>
       </w:pPr>
       <w:r>
         <w:t xml:space="preserve">9. Reducción de dimensionalidad</w:t>
@@ -10323,7 +10664,7 @@
           <wp:inline distT="0" distB="0" distL="0" distR="0">
             <wp:extent cx="5943600" cy="2533650"/>
             <wp:effectExtent t="0" r="0" b="0" l="0"/>
-            <wp:docPr id="6" name="fig6_pca_umap.png" descr="Pacientes de prueba proyectados con PCA y UMAP, coloreados por su clase real" title="Pacientes de prueba proyectados con PCA y UMAP, coloreados por su clase real"/>
+            <wp:docPr id="8" name="fig6_pca_umap.png" descr="Pacientes de prueba proyectados con PCA y UMAP, coloreados por su clase real" title="Pacientes de prueba proyectados con PCA y UMAP, coloreados por su clase real"/>
             <wp:cNvGraphicFramePr>
               <a:graphicFrameLocks xmlns:a="http://schemas.openxmlformats.org/drawingml/2006/main" noChangeAspect="1"/>
             </wp:cNvGraphicFramePr>
@@ -10337,7 +10678,7 @@
                     </pic:cNvPicPr>
                   </pic:nvPicPr>
                   <pic:blipFill>
-                    <a:blip r:embed="rId14" cstate="none"/>
+                    <a:blip r:embed="rId18" cstate="none"/>
                     <a:srcRect/>
                     <a:stretch>
                       <a:fillRect/>
@@ -10518,6 +10859,8 @@
     <w:p>
       <w:pPr>
         <w:pStyle w:val="Heading1"/>
+        <w:keepNext/>
+        <w:keepLines/>
       </w:pPr>
       <w:r>
         <w:t xml:space="preserve">10. Visualización interactiva</w:t>
@@ -11299,6 +11642,8 @@
     <w:p>
       <w:pPr>
         <w:pStyle w:val="Heading2"/>
+        <w:keepNext/>
+        <w:keepLines/>
       </w:pPr>
       <w:r>
         <w:t xml:space="preserve">Herramientas utilizadas</w:t>
@@ -12129,6 +12474,8 @@
     <w:p>
       <w:pPr>
         <w:pStyle w:val="Heading1"/>
+        <w:keepNext/>
+        <w:keepLines/>
       </w:pPr>
       <w:r>
         <w:t xml:space="preserve">11. Limitaciones y consideraciones éticas</w:t>
@@ -12238,6 +12585,8 @@
     <w:p>
       <w:pPr>
         <w:pStyle w:val="Heading1"/>
+        <w:keepNext/>
+        <w:keepLines/>
       </w:pPr>
       <w:r>
         <w:t xml:space="preserve">12. Conclusiones</w:t>
@@ -12253,7 +12602,7 @@
         <w:spacing w:after="80" w:line="276"/>
       </w:pPr>
       <w:r>
-        <w:t xml:space="preserve">Un examen médico de rutina contiene información suficiente para anticipar la ECV con un AUC de 0,80, pero no más. Los tres modelos llegan al mismo techo, y las curvas de aprendizaje muestran que más registros no lo moverían.</w:t>
+        <w:t xml:space="preserve">Un examen médico de rutina contiene información suficiente para anticipar la ECV con un AUC de 0,80, pero no más. Los tres modelos llegan al mismo techo, y las curvas de aprendizaje muestran que más registros no lo mejorarían.</w:t>
       </w:r>
     </w:p>
     <w:p>
@@ -12311,6 +12660,8 @@
     <w:p>
       <w:pPr>
         <w:pStyle w:val="Heading1"/>
+        <w:keepNext/>
+        <w:keepLines/>
       </w:pPr>
       <w:r>
         <w:t xml:space="preserve">13. Recomendaciones</w:t>
@@ -12371,6 +12722,8 @@
     <w:p>
       <w:pPr>
         <w:pStyle w:val="Heading1"/>
+        <w:keepNext/>
+        <w:keepLines/>
       </w:pPr>
       <w:r>
         <w:t xml:space="preserve">14. Entregables y reproducibilidad</w:t>
@@ -13137,7 +13490,7 @@
                 <w:sz w:val="19"/>
                 <w:szCs w:val="19"/>
               </w:rPr>
-              <w:t xml:space="preserve">Regenera las seis figuras de este informe a partir de los mismos resultados</w:t>
+              <w:t xml:space="preserve">Regenera las seis figuras de este informe a partir de los mismos resultados; la carpeta guarda también las imágenes de la portada</w:t>
             </w:r>
           </w:p>
         </w:tc>
@@ -13244,6 +13597,8 @@
     <w:p>
       <w:pPr>
         <w:pStyle w:val="Heading1"/>
+        <w:keepNext/>
+        <w:keepLines/>
       </w:pPr>
       <w:r>
         <w:t xml:space="preserve">15. Glosario</w:t>
@@ -14361,6 +14716,8 @@
     <w:p>
       <w:pPr>
         <w:pStyle w:val="Heading1"/>
+        <w:keepNext/>
+        <w:keepLines/>
       </w:pPr>
       <w:r>
         <w:t xml:space="preserve">16. Referencias</w:t>
@@ -14966,6 +15323,8 @@
     <w:p>
       <w:pPr>
         <w:pStyle w:val="Heading1"/>
+        <w:keepNext/>
+        <w:keepLines/>
       </w:pPr>
       <w:r>
         <w:t xml:space="preserve">17. Uso de inteligencia artificial y responsabilidad de la autoría</w:t>
@@ -14997,10 +15356,13 @@
     </w:p>
     <w:sectPr>
       <w:headerReference w:type="default" r:id="rId6"/>
-      <w:footerReference w:type="default" r:id="rId7"/>
+      <w:headerReference w:type="first" r:id="rId7"/>
+      <w:footerReference w:type="default" r:id="rId8"/>
+      <w:footerReference w:type="first" r:id="rId9"/>
       <w:pgSz w:w="12240" w:h="15840" w:orient="portrait"/>
       <w:pgMar w:top="1440" w:right="1440" w:bottom="1440" w:left="1440" w:header="708" w:footer="708" w:gutter="0"/>
       <w:pgNumType/>
+      <w:titlePg/>
       <w:docGrid w:linePitch="360"/>
     </w:sectPr>
   </w:body>
@@ -15057,17 +15419,44 @@
         <w:szCs w:val="16"/>
       </w:rPr>
       <w:t xml:space="preserve">Página </w:t>
+    </w:r>
+    <w:r>
+      <w:rPr>
+        <w:color w:val="857E7C"/>
+        <w:sz w:val="16"/>
+        <w:szCs w:val="16"/>
+      </w:rPr>
       <w:fldChar w:fldCharType="begin"/>
       <w:instrText xml:space="preserve">PAGE</w:instrText>
       <w:fldChar w:fldCharType="separate"/>
       <w:fldChar w:fldCharType="end"/>
+    </w:r>
+    <w:r>
+      <w:rPr>
+        <w:color w:val="857E7C"/>
+        <w:sz w:val="16"/>
+        <w:szCs w:val="16"/>
+      </w:rPr>
       <w:t xml:space="preserve"> de </w:t>
+    </w:r>
+    <w:r>
+      <w:rPr>
+        <w:color w:val="857E7C"/>
+        <w:sz w:val="16"/>
+        <w:szCs w:val="16"/>
+      </w:rPr>
       <w:fldChar w:fldCharType="begin"/>
       <w:instrText xml:space="preserve">NUMPAGES</w:instrText>
       <w:fldChar w:fldCharType="separate"/>
       <w:fldChar w:fldCharType="end"/>
     </w:r>
   </w:p>
+</w:ftr>
+</file>
+
+<file path=word/footer2.xml><?xml version="1.0" encoding="utf-8"?>
+<w:ftr xmlns:wpc="http://schemas.microsoft.com/office/word/2010/wordprocessingCanvas" xmlns:mc="http://schemas.openxmlformats.org/markup-compatibility/2006" xmlns:o="urn:schemas-microsoft-com:office:office" xmlns:r="http://schemas.openxmlformats.org/officeDocument/2006/relationships" xmlns:m="http://schemas.openxmlformats.org/officeDocument/2006/math" xmlns:v="urn:schemas-microsoft-com:vml" xmlns:wp14="http://schemas.microsoft.com/office/word/2010/wordprocessingDrawing" xmlns:wp="http://schemas.openxmlformats.org/drawingml/2006/wordprocessingDrawing" xmlns:w10="urn:schemas-microsoft-com:office:word" xmlns:w="http://schemas.openxmlformats.org/wordprocessingml/2006/main" xmlns:w14="http://schemas.microsoft.com/office/word/2010/wordml" xmlns:w15="http://schemas.microsoft.com/office/word/2012/wordml" xmlns:wpg="http://schemas.microsoft.com/office/word/2010/wordprocessingGroup" xmlns:wpi="http://schemas.microsoft.com/office/word/2010/wordprocessingInk" xmlns:wne="http://schemas.microsoft.com/office/word/2006/wordml" xmlns:wps="http://schemas.microsoft.com/office/word/2010/wordprocessingShape">
+  <w:p/>
 </w:ftr>
 </file>
 
@@ -15123,6 +15512,12 @@
       <w:t xml:space="preserve">Proyecto Final · Predicción de riesgo cardiovascular</w:t>
     </w:r>
   </w:p>
+</w:hdr>
+</file>
+
+<file path=word/header2.xml><?xml version="1.0" encoding="utf-8"?>
+<w:hdr xmlns:wpc="http://schemas.microsoft.com/office/word/2010/wordprocessingCanvas" xmlns:mc="http://schemas.openxmlformats.org/markup-compatibility/2006" xmlns:o="urn:schemas-microsoft-com:office:office" xmlns:r="http://schemas.openxmlformats.org/officeDocument/2006/relationships" xmlns:m="http://schemas.openxmlformats.org/officeDocument/2006/math" xmlns:v="urn:schemas-microsoft-com:vml" xmlns:wp14="http://schemas.microsoft.com/office/word/2010/wordprocessingDrawing" xmlns:wp="http://schemas.openxmlformats.org/drawingml/2006/wordprocessingDrawing" xmlns:w10="urn:schemas-microsoft-com:office:word" xmlns:w="http://schemas.openxmlformats.org/wordprocessingml/2006/main" xmlns:w14="http://schemas.microsoft.com/office/word/2010/wordml" xmlns:w15="http://schemas.microsoft.com/office/word/2012/wordml" xmlns:wpg="http://schemas.microsoft.com/office/word/2010/wordprocessingGroup" xmlns:wpi="http://schemas.microsoft.com/office/word/2010/wordprocessingInk" xmlns:wne="http://schemas.microsoft.com/office/word/2006/wordml" xmlns:wps="http://schemas.microsoft.com/office/word/2010/wordprocessingShape" xmlns:cx="http://schemas.microsoft.com/office/drawing/2014/chartex" xmlns:cx1="http://schemas.microsoft.com/office/drawing/2015/9/8/chartex" xmlns:cx2="http://schemas.microsoft.com/office/drawing/2015/10/21/chartex" xmlns:cx3="http://schemas.microsoft.com/office/drawing/2016/5/9/chartex" xmlns:cx4="http://schemas.microsoft.com/office/drawing/2016/5/10/chartex" xmlns:cx5="http://schemas.microsoft.com/office/drawing/2016/5/11/chartex" xmlns:cx6="http://schemas.microsoft.com/office/drawing/2016/5/12/chartex" xmlns:cx7="http://schemas.microsoft.com/office/drawing/2016/5/13/chartex" xmlns:cx8="http://schemas.microsoft.com/office/drawing/2016/5/14/chartex" xmlns:w16cid="http://schemas.microsoft.com/office/word/2016/wordml/cid" xmlns:w16se="http://schemas.microsoft.com/office/word/2015/wordml/symex">
+  <w:p/>
 </w:hdr>
 </file>
 

</xml_diff>